<commit_message>
Texto, tablas y formularios
</commit_message>
<xml_diff>
--- a/assets/_docs_/pasos_dis_web_layout.docx
+++ b/assets/_docs_/pasos_dis_web_layout.docx
@@ -442,14 +442,7 @@
           <w:highlight w:val="yellow"/>
           <w:lang w:val="es-MX"/>
         </w:rPr>
-        <w:t xml:space="preserve">HEXADECIMAL: </w:t>
-      </w:r>
-      <w:r>
-        <w:rPr>
-          <w:highlight w:val="yellow"/>
-          <w:lang w:val="es-MX"/>
-        </w:rPr>
-        <w:t>(</w:t>
+        <w:t>HEXADECIMAL: (</w:t>
       </w:r>
       <w:proofErr w:type="gramStart"/>
       <w:r>
@@ -465,21 +458,7 @@
           <w:highlight w:val="yellow"/>
           <w:lang w:val="es-MX"/>
         </w:rPr>
-        <w:t>Rojo)-&gt;</w:t>
-      </w:r>
-      <w:r>
-        <w:rPr>
-          <w:highlight w:val="yellow"/>
-          <w:lang w:val="es-MX"/>
-        </w:rPr>
-        <w:t>0-F</w:t>
-      </w:r>
-      <w:r>
-        <w:rPr>
-          <w:highlight w:val="yellow"/>
-          <w:lang w:val="es-MX"/>
-        </w:rPr>
-        <w:t xml:space="preserve">, </w:t>
+        <w:t xml:space="preserve">Rojo)-&gt;0-F, </w:t>
       </w:r>
       <w:proofErr w:type="gramStart"/>
       <w:r>
@@ -495,21 +474,7 @@
           <w:highlight w:val="yellow"/>
           <w:lang w:val="es-MX"/>
         </w:rPr>
-        <w:t>Verde)-&gt;</w:t>
-      </w:r>
-      <w:r>
-        <w:rPr>
-          <w:highlight w:val="yellow"/>
-          <w:lang w:val="es-MX"/>
-        </w:rPr>
-        <w:t>0-F</w:t>
-      </w:r>
-      <w:r>
-        <w:rPr>
-          <w:highlight w:val="yellow"/>
-          <w:lang w:val="es-MX"/>
-        </w:rPr>
-        <w:t xml:space="preserve">, </w:t>
+        <w:t xml:space="preserve">Verde)-&gt;0-F, </w:t>
       </w:r>
       <w:proofErr w:type="gramStart"/>
       <w:r>
@@ -525,21 +490,7 @@
           <w:highlight w:val="yellow"/>
           <w:lang w:val="es-MX"/>
         </w:rPr>
-        <w:t>Azul)-&gt;</w:t>
-      </w:r>
-      <w:r>
-        <w:rPr>
-          <w:highlight w:val="yellow"/>
-          <w:lang w:val="es-MX"/>
-        </w:rPr>
-        <w:t>0-F</w:t>
-      </w:r>
-      <w:r>
-        <w:rPr>
-          <w:highlight w:val="yellow"/>
-          <w:lang w:val="es-MX"/>
-        </w:rPr>
-        <w:t>)</w:t>
+        <w:t>Azul)-&gt;0-F)</w:t>
       </w:r>
     </w:p>
     <w:p>
@@ -550,17 +501,20 @@
           <w:numId w:val="1"/>
         </w:numPr>
         <w:rPr>
-          <w:lang w:val="es-MX"/>
-        </w:rPr>
-      </w:pPr>
-      <w:r>
-        <w:rPr>
+          <w:highlight w:val="yellow"/>
+          <w:lang w:val="es-MX"/>
+        </w:rPr>
+      </w:pPr>
+      <w:r>
+        <w:rPr>
+          <w:highlight w:val="yellow"/>
           <w:lang w:val="es-MX"/>
         </w:rPr>
         <w:t>Imágenes</w:t>
       </w:r>
       <w:r>
         <w:rPr>
+          <w:highlight w:val="yellow"/>
           <w:lang w:val="es-MX"/>
         </w:rPr>
         <w:t xml:space="preserve"> (Fotografías -&gt; *.</w:t>
@@ -568,6 +522,7 @@
       <w:proofErr w:type="spellStart"/>
       <w:r>
         <w:rPr>
+          <w:highlight w:val="yellow"/>
           <w:lang w:val="es-MX"/>
         </w:rPr>
         <w:t>jpg</w:t>
@@ -575,6 +530,7 @@
       <w:proofErr w:type="spellEnd"/>
       <w:r>
         <w:rPr>
+          <w:highlight w:val="yellow"/>
           <w:lang w:val="es-MX"/>
         </w:rPr>
         <w:t>. Logos -&gt; *.png o *.</w:t>
@@ -582,6 +538,7 @@
       <w:proofErr w:type="spellStart"/>
       <w:r>
         <w:rPr>
+          <w:highlight w:val="yellow"/>
           <w:lang w:val="es-MX"/>
         </w:rPr>
         <w:t>svg</w:t>
@@ -589,6 +546,7 @@
       <w:proofErr w:type="spellEnd"/>
       <w:r>
         <w:rPr>
+          <w:highlight w:val="yellow"/>
           <w:lang w:val="es-MX"/>
         </w:rPr>
         <w:t>)</w:t>
@@ -599,11 +557,13 @@
         <w:pStyle w:val="Prrafodelista"/>
         <w:ind w:left="1440"/>
         <w:rPr>
-          <w:lang w:val="es-MX"/>
-        </w:rPr>
-      </w:pPr>
-      <w:r>
-        <w:rPr>
+          <w:highlight w:val="yellow"/>
+          <w:lang w:val="es-MX"/>
+        </w:rPr>
+      </w:pPr>
+      <w:r>
+        <w:rPr>
+          <w:highlight w:val="yellow"/>
           <w:lang w:val="es-MX"/>
         </w:rPr>
         <w:t>*.</w:t>
@@ -611,6 +571,7 @@
       <w:proofErr w:type="spellStart"/>
       <w:r>
         <w:rPr>
+          <w:highlight w:val="yellow"/>
           <w:lang w:val="es-MX"/>
         </w:rPr>
         <w:t>jpg</w:t>
@@ -618,6 +579,7 @@
       <w:proofErr w:type="spellEnd"/>
       <w:r>
         <w:rPr>
+          <w:highlight w:val="yellow"/>
           <w:lang w:val="es-MX"/>
         </w:rPr>
         <w:t>: Pixeles</w:t>
@@ -633,6 +595,7 @@
       </w:pPr>
       <w:r>
         <w:rPr>
+          <w:highlight w:val="yellow"/>
           <w:lang w:val="es-MX"/>
         </w:rPr>
         <w:t>*.png o *.</w:t>
@@ -640,6 +603,7 @@
       <w:proofErr w:type="spellStart"/>
       <w:r>
         <w:rPr>
+          <w:highlight w:val="yellow"/>
           <w:lang w:val="es-MX"/>
         </w:rPr>
         <w:t>svg</w:t>
@@ -647,19 +611,11 @@
       <w:proofErr w:type="spellEnd"/>
       <w:r>
         <w:rPr>
+          <w:highlight w:val="yellow"/>
           <w:lang w:val="es-MX"/>
         </w:rPr>
         <w:t>: Vectores</w:t>
       </w:r>
-    </w:p>
-    <w:p>
-      <w:pPr>
-        <w:pStyle w:val="Prrafodelista"/>
-        <w:ind w:left="1440"/>
-        <w:rPr>
-          <w:lang w:val="es-MX"/>
-        </w:rPr>
-      </w:pPr>
     </w:p>
     <w:p>
       <w:pPr>
@@ -669,14 +625,55 @@
           <w:numId w:val="1"/>
         </w:numPr>
         <w:rPr>
-          <w:lang w:val="es-MX"/>
-        </w:rPr>
-      </w:pPr>
-      <w:r>
-        <w:rPr>
+          <w:highlight w:val="yellow"/>
+          <w:lang w:val="es-MX"/>
+        </w:rPr>
+      </w:pPr>
+      <w:r>
+        <w:rPr>
+          <w:highlight w:val="yellow"/>
           <w:lang w:val="es-MX"/>
         </w:rPr>
         <w:t>Texto</w:t>
+      </w:r>
+      <w:r>
+        <w:rPr>
+          <w:highlight w:val="yellow"/>
+          <w:lang w:val="es-MX"/>
+        </w:rPr>
+        <w:t xml:space="preserve">: Niveles. Título &lt;h1&gt;, Subtítulos &lt;h2&gt;, párrafos &lt;p&gt;. CSS: </w:t>
+      </w:r>
+      <w:proofErr w:type="spellStart"/>
+      <w:r>
+        <w:rPr>
+          <w:highlight w:val="yellow"/>
+          <w:lang w:val="es-MX"/>
+        </w:rPr>
+        <w:t>text-align</w:t>
+      </w:r>
+      <w:proofErr w:type="spellEnd"/>
+      <w:r>
+        <w:rPr>
+          <w:highlight w:val="yellow"/>
+          <w:lang w:val="es-MX"/>
+        </w:rPr>
+        <w:t xml:space="preserve">, </w:t>
+      </w:r>
+      <w:proofErr w:type="spellStart"/>
+      <w:r>
+        <w:rPr>
+          <w:highlight w:val="yellow"/>
+          <w:lang w:val="es-MX"/>
+        </w:rPr>
+        <w:t>font-size</w:t>
+      </w:r>
+      <w:proofErr w:type="spellEnd"/>
+      <w:r>
+        <w:rPr>
+          <w:highlight w:val="yellow"/>
+          <w:lang w:val="es-MX"/>
+        </w:rPr>
+        <w:t xml:space="preserve">. Máximo 2 tipos de fuente. </w:t>
       </w:r>
     </w:p>
     <w:p>
@@ -687,11 +684,13 @@
           <w:numId w:val="1"/>
         </w:numPr>
         <w:rPr>
-          <w:lang w:val="es-MX"/>
-        </w:rPr>
-      </w:pPr>
-      <w:r>
-        <w:rPr>
+          <w:highlight w:val="red"/>
+          <w:lang w:val="es-MX"/>
+        </w:rPr>
+      </w:pPr>
+      <w:r>
+        <w:rPr>
+          <w:highlight w:val="red"/>
           <w:lang w:val="es-MX"/>
         </w:rPr>
         <w:t>Sonidos</w:t>
@@ -705,11 +704,13 @@
           <w:numId w:val="1"/>
         </w:numPr>
         <w:rPr>
-          <w:lang w:val="es-MX"/>
-        </w:rPr>
-      </w:pPr>
-      <w:r>
-        <w:rPr>
+          <w:highlight w:val="yellow"/>
+          <w:lang w:val="es-MX"/>
+        </w:rPr>
+      </w:pPr>
+      <w:r>
+        <w:rPr>
+          <w:highlight w:val="yellow"/>
           <w:lang w:val="es-MX"/>
         </w:rPr>
         <w:t>Vídeos</w:t>
@@ -723,11 +724,13 @@
           <w:numId w:val="1"/>
         </w:numPr>
         <w:rPr>
-          <w:lang w:val="es-MX"/>
-        </w:rPr>
-      </w:pPr>
-      <w:r>
-        <w:rPr>
+          <w:highlight w:val="yellow"/>
+          <w:lang w:val="es-MX"/>
+        </w:rPr>
+      </w:pPr>
+      <w:r>
+        <w:rPr>
+          <w:highlight w:val="yellow"/>
           <w:lang w:val="es-MX"/>
         </w:rPr>
         <w:t>Tablas</w:t>
@@ -741,11 +744,13 @@
           <w:numId w:val="1"/>
         </w:numPr>
         <w:rPr>
-          <w:lang w:val="es-MX"/>
-        </w:rPr>
-      </w:pPr>
-      <w:r>
-        <w:rPr>
+          <w:highlight w:val="yellow"/>
+          <w:lang w:val="es-MX"/>
+        </w:rPr>
+      </w:pPr>
+      <w:r>
+        <w:rPr>
+          <w:highlight w:val="yellow"/>
           <w:lang w:val="es-MX"/>
         </w:rPr>
         <w:t>Formularios</w:t>
@@ -2272,23 +2277,6 @@
 </file>
 
 <file path=customXml/item1.xml><?xml version="1.0" encoding="utf-8"?>
-<p:properties xmlns:p="http://schemas.microsoft.com/office/2006/metadata/properties" xmlns:xsi="http://www.w3.org/2001/XMLSchema-instance" xmlns:pc="http://schemas.microsoft.com/office/infopath/2007/PartnerControls">
-  <documentManagement>
-    <_activity xmlns="4e322917-71b7-4e5c-a951-8b2861783ab6" xsi:nil="true"/>
-  </documentManagement>
-</p:properties>
-</file>
-
-<file path=customXml/item2.xml><?xml version="1.0" encoding="utf-8"?>
-<?mso-contentType ?>
-<FormTemplates xmlns="http://schemas.microsoft.com/sharepoint/v3/contenttype/forms">
-  <Display>DocumentLibraryForm</Display>
-  <Edit>DocumentLibraryForm</Edit>
-  <New>DocumentLibraryForm</New>
-</FormTemplates>
-</file>
-
-<file path=customXml/item3.xml><?xml version="1.0" encoding="utf-8"?>
 <ct:contentTypeSchema xmlns:ct="http://schemas.microsoft.com/office/2006/metadata/contentType" xmlns:ma="http://schemas.microsoft.com/office/2006/metadata/properties/metaAttributes" ct:_="" ma:_="" ma:contentTypeName="Documento" ma:contentTypeID="0x01010022CA72AA7D58C04EAE5FA26066EA7421" ma:contentTypeVersion="12" ma:contentTypeDescription="Crear nuevo documento." ma:contentTypeScope="" ma:versionID="c464f4327925802dacfc323c0698542a">
   <xsd:schema xmlns:xsd="http://www.w3.org/2001/XMLSchema" xmlns:xs="http://www.w3.org/2001/XMLSchema" xmlns:p="http://schemas.microsoft.com/office/2006/metadata/properties" xmlns:ns3="4e322917-71b7-4e5c-a951-8b2861783ab6" targetNamespace="http://schemas.microsoft.com/office/2006/metadata/properties" ma:root="true" ma:fieldsID="4b44adde400c0a67df9d832cebb4cd39" ns3:_="">
     <xsd:import namespace="4e322917-71b7-4e5c-a951-8b2861783ab6"/>
@@ -2482,25 +2470,24 @@
 </ct:contentTypeSchema>
 </file>
 
-<file path=customXml/itemProps1.xml><?xml version="1.0" encoding="utf-8"?>
-<ds:datastoreItem xmlns:ds="http://schemas.openxmlformats.org/officeDocument/2006/customXml" ds:itemID="{DDA439CF-5EDE-47E0-85E7-9F2BA1DA9B6A}">
-  <ds:schemaRefs>
-    <ds:schemaRef ds:uri="http://schemas.microsoft.com/office/2006/metadata/properties"/>
-    <ds:schemaRef ds:uri="http://schemas.microsoft.com/office/infopath/2007/PartnerControls"/>
-    <ds:schemaRef ds:uri="4e322917-71b7-4e5c-a951-8b2861783ab6"/>
-  </ds:schemaRefs>
-</ds:datastoreItem>
+<file path=customXml/item2.xml><?xml version="1.0" encoding="utf-8"?>
+<?mso-contentType ?>
+<FormTemplates xmlns="http://schemas.microsoft.com/sharepoint/v3/contenttype/forms">
+  <Display>DocumentLibraryForm</Display>
+  <Edit>DocumentLibraryForm</Edit>
+  <New>DocumentLibraryForm</New>
+</FormTemplates>
 </file>
 
-<file path=customXml/itemProps2.xml><?xml version="1.0" encoding="utf-8"?>
-<ds:datastoreItem xmlns:ds="http://schemas.openxmlformats.org/officeDocument/2006/customXml" ds:itemID="{A9565208-D533-4E90-8D6B-59E1A3EAD1AD}">
-  <ds:schemaRefs>
-    <ds:schemaRef ds:uri="http://schemas.microsoft.com/sharepoint/v3/contenttype/forms"/>
-  </ds:schemaRefs>
-</ds:datastoreItem>
+<file path=customXml/item3.xml><?xml version="1.0" encoding="utf-8"?>
+<p:properties xmlns:p="http://schemas.microsoft.com/office/2006/metadata/properties" xmlns:xsi="http://www.w3.org/2001/XMLSchema-instance" xmlns:pc="http://schemas.microsoft.com/office/infopath/2007/PartnerControls">
+  <documentManagement>
+    <_activity xmlns="4e322917-71b7-4e5c-a951-8b2861783ab6" xsi:nil="true"/>
+  </documentManagement>
+</p:properties>
 </file>
 
-<file path=customXml/itemProps3.xml><?xml version="1.0" encoding="utf-8"?>
+<file path=customXml/itemProps1.xml><?xml version="1.0" encoding="utf-8"?>
 <ds:datastoreItem xmlns:ds="http://schemas.openxmlformats.org/officeDocument/2006/customXml" ds:itemID="{E3B8FDC8-B83E-44CB-84D1-147F6FF546B9}">
   <ds:schemaRefs>
     <ds:schemaRef ds:uri="http://schemas.microsoft.com/office/2006/metadata/contentType"/>
@@ -2516,4 +2503,22 @@
     <ds:schemaRef ds:uri="http://schemas.microsoft.com/internal/obd"/>
   </ds:schemaRefs>
 </ds:datastoreItem>
+</file>
+
+<file path=customXml/itemProps2.xml><?xml version="1.0" encoding="utf-8"?>
+<ds:datastoreItem xmlns:ds="http://schemas.openxmlformats.org/officeDocument/2006/customXml" ds:itemID="{A9565208-D533-4E90-8D6B-59E1A3EAD1AD}">
+  <ds:schemaRefs>
+    <ds:schemaRef ds:uri="http://schemas.microsoft.com/sharepoint/v3/contenttype/forms"/>
+  </ds:schemaRefs>
+</ds:datastoreItem>
+</file>
+
+<file path=customXml/itemProps3.xml><?xml version="1.0" encoding="utf-8"?>
+<ds:datastoreItem xmlns:ds="http://schemas.openxmlformats.org/officeDocument/2006/customXml" ds:itemID="{DDA439CF-5EDE-47E0-85E7-9F2BA1DA9B6A}">
+  <ds:schemaRefs>
+    <ds:schemaRef ds:uri="http://schemas.microsoft.com/office/2006/metadata/properties"/>
+    <ds:schemaRef ds:uri="http://schemas.microsoft.com/office/infopath/2007/PartnerControls"/>
+    <ds:schemaRef ds:uri="4e322917-71b7-4e5c-a951-8b2861783ab6"/>
+  </ds:schemaRefs>
+</ds:datastoreItem>
 </file>
</xml_diff>

<commit_message>
validación de formularios html, css y js
</commit_message>
<xml_diff>
--- a/assets/_docs_/pasos_dis_web_layout.docx
+++ b/assets/_docs_/pasos_dis_web_layout.docx
@@ -834,21 +834,7 @@
           <w:highlight w:val="yellow"/>
           <w:lang w:val="es-MX"/>
         </w:rPr>
-        <w:t xml:space="preserve"> de </w:t>
-      </w:r>
-      <w:r>
-        <w:rPr>
-          <w:highlight w:val="yellow"/>
-          <w:lang w:val="es-MX"/>
-        </w:rPr>
-        <w:t>Iconografía</w:t>
-      </w:r>
-      <w:r>
-        <w:rPr>
-          <w:highlight w:val="yellow"/>
-          <w:lang w:val="es-MX"/>
-        </w:rPr>
-        <w:t>)</w:t>
+        <w:t xml:space="preserve"> de Iconografía)</w:t>
       </w:r>
     </w:p>
     <w:p>
@@ -937,12 +923,14 @@
           <w:numId w:val="1"/>
         </w:numPr>
         <w:rPr>
+          <w:highlight w:val="yellow"/>
           <w:lang w:val="es-MX"/>
         </w:rPr>
       </w:pPr>
       <w:proofErr w:type="spellStart"/>
       <w:r>
         <w:rPr>
+          <w:highlight w:val="yellow"/>
           <w:lang w:val="es-MX"/>
         </w:rPr>
         <w:t>Iframe</w:t>
@@ -965,6 +953,34 @@
           <w:lang w:val="es-MX"/>
         </w:rPr>
         <w:t>Validación Formularios (</w:t>
+      </w:r>
+      <w:proofErr w:type="spellStart"/>
+      <w:r>
+        <w:rPr>
+          <w:lang w:val="es-MX"/>
+        </w:rPr>
+        <w:t>Html</w:t>
+      </w:r>
+      <w:proofErr w:type="spellEnd"/>
+      <w:r>
+        <w:rPr>
+          <w:lang w:val="es-MX"/>
+        </w:rPr>
+        <w:t xml:space="preserve">, </w:t>
+      </w:r>
+      <w:proofErr w:type="spellStart"/>
+      <w:r>
+        <w:rPr>
+          <w:lang w:val="es-MX"/>
+        </w:rPr>
+        <w:t>Css</w:t>
+      </w:r>
+      <w:proofErr w:type="spellEnd"/>
+      <w:r>
+        <w:rPr>
+          <w:lang w:val="es-MX"/>
+        </w:rPr>
+        <w:t xml:space="preserve">, </w:t>
       </w:r>
       <w:proofErr w:type="spellStart"/>
       <w:r>
@@ -2354,23 +2370,6 @@
 </file>
 
 <file path=customXml/item1.xml><?xml version="1.0" encoding="utf-8"?>
-<p:properties xmlns:p="http://schemas.microsoft.com/office/2006/metadata/properties" xmlns:xsi="http://www.w3.org/2001/XMLSchema-instance" xmlns:pc="http://schemas.microsoft.com/office/infopath/2007/PartnerControls">
-  <documentManagement>
-    <_activity xmlns="4e322917-71b7-4e5c-a951-8b2861783ab6" xsi:nil="true"/>
-  </documentManagement>
-</p:properties>
-</file>
-
-<file path=customXml/item2.xml><?xml version="1.0" encoding="utf-8"?>
-<?mso-contentType ?>
-<FormTemplates xmlns="http://schemas.microsoft.com/sharepoint/v3/contenttype/forms">
-  <Display>DocumentLibraryForm</Display>
-  <Edit>DocumentLibraryForm</Edit>
-  <New>DocumentLibraryForm</New>
-</FormTemplates>
-</file>
-
-<file path=customXml/item3.xml><?xml version="1.0" encoding="utf-8"?>
 <ct:contentTypeSchema xmlns:ct="http://schemas.microsoft.com/office/2006/metadata/contentType" xmlns:ma="http://schemas.microsoft.com/office/2006/metadata/properties/metaAttributes" ct:_="" ma:_="" ma:contentTypeName="Documento" ma:contentTypeID="0x01010022CA72AA7D58C04EAE5FA26066EA7421" ma:contentTypeVersion="12" ma:contentTypeDescription="Crear nuevo documento." ma:contentTypeScope="" ma:versionID="c464f4327925802dacfc323c0698542a">
   <xsd:schema xmlns:xsd="http://www.w3.org/2001/XMLSchema" xmlns:xs="http://www.w3.org/2001/XMLSchema" xmlns:p="http://schemas.microsoft.com/office/2006/metadata/properties" xmlns:ns3="4e322917-71b7-4e5c-a951-8b2861783ab6" targetNamespace="http://schemas.microsoft.com/office/2006/metadata/properties" ma:root="true" ma:fieldsID="4b44adde400c0a67df9d832cebb4cd39" ns3:_="">
     <xsd:import namespace="4e322917-71b7-4e5c-a951-8b2861783ab6"/>
@@ -2564,25 +2563,24 @@
 </ct:contentTypeSchema>
 </file>
 
-<file path=customXml/itemProps1.xml><?xml version="1.0" encoding="utf-8"?>
-<ds:datastoreItem xmlns:ds="http://schemas.openxmlformats.org/officeDocument/2006/customXml" ds:itemID="{DDA439CF-5EDE-47E0-85E7-9F2BA1DA9B6A}">
-  <ds:schemaRefs>
-    <ds:schemaRef ds:uri="http://schemas.microsoft.com/office/2006/metadata/properties"/>
-    <ds:schemaRef ds:uri="http://schemas.microsoft.com/office/infopath/2007/PartnerControls"/>
-    <ds:schemaRef ds:uri="4e322917-71b7-4e5c-a951-8b2861783ab6"/>
-  </ds:schemaRefs>
-</ds:datastoreItem>
+<file path=customXml/item2.xml><?xml version="1.0" encoding="utf-8"?>
+<?mso-contentType ?>
+<FormTemplates xmlns="http://schemas.microsoft.com/sharepoint/v3/contenttype/forms">
+  <Display>DocumentLibraryForm</Display>
+  <Edit>DocumentLibraryForm</Edit>
+  <New>DocumentLibraryForm</New>
+</FormTemplates>
 </file>
 
-<file path=customXml/itemProps2.xml><?xml version="1.0" encoding="utf-8"?>
-<ds:datastoreItem xmlns:ds="http://schemas.openxmlformats.org/officeDocument/2006/customXml" ds:itemID="{A9565208-D533-4E90-8D6B-59E1A3EAD1AD}">
-  <ds:schemaRefs>
-    <ds:schemaRef ds:uri="http://schemas.microsoft.com/sharepoint/v3/contenttype/forms"/>
-  </ds:schemaRefs>
-</ds:datastoreItem>
+<file path=customXml/item3.xml><?xml version="1.0" encoding="utf-8"?>
+<p:properties xmlns:p="http://schemas.microsoft.com/office/2006/metadata/properties" xmlns:xsi="http://www.w3.org/2001/XMLSchema-instance" xmlns:pc="http://schemas.microsoft.com/office/infopath/2007/PartnerControls">
+  <documentManagement>
+    <_activity xmlns="4e322917-71b7-4e5c-a951-8b2861783ab6" xsi:nil="true"/>
+  </documentManagement>
+</p:properties>
 </file>
 
-<file path=customXml/itemProps3.xml><?xml version="1.0" encoding="utf-8"?>
+<file path=customXml/itemProps1.xml><?xml version="1.0" encoding="utf-8"?>
 <ds:datastoreItem xmlns:ds="http://schemas.openxmlformats.org/officeDocument/2006/customXml" ds:itemID="{E3B8FDC8-B83E-44CB-84D1-147F6FF546B9}">
   <ds:schemaRefs>
     <ds:schemaRef ds:uri="http://schemas.microsoft.com/office/2006/metadata/contentType"/>
@@ -2598,4 +2596,22 @@
     <ds:schemaRef ds:uri="http://schemas.microsoft.com/internal/obd"/>
   </ds:schemaRefs>
 </ds:datastoreItem>
+</file>
+
+<file path=customXml/itemProps2.xml><?xml version="1.0" encoding="utf-8"?>
+<ds:datastoreItem xmlns:ds="http://schemas.openxmlformats.org/officeDocument/2006/customXml" ds:itemID="{A9565208-D533-4E90-8D6B-59E1A3EAD1AD}">
+  <ds:schemaRefs>
+    <ds:schemaRef ds:uri="http://schemas.microsoft.com/sharepoint/v3/contenttype/forms"/>
+  </ds:schemaRefs>
+</ds:datastoreItem>
+</file>
+
+<file path=customXml/itemProps3.xml><?xml version="1.0" encoding="utf-8"?>
+<ds:datastoreItem xmlns:ds="http://schemas.openxmlformats.org/officeDocument/2006/customXml" ds:itemID="{DDA439CF-5EDE-47E0-85E7-9F2BA1DA9B6A}">
+  <ds:schemaRefs>
+    <ds:schemaRef ds:uri="http://schemas.microsoft.com/office/2006/metadata/properties"/>
+    <ds:schemaRef ds:uri="http://schemas.microsoft.com/office/infopath/2007/PartnerControls"/>
+    <ds:schemaRef ds:uri="4e322917-71b7-4e5c-a951-8b2861783ab6"/>
+  </ds:schemaRefs>
+</ds:datastoreItem>
 </file>
</xml_diff>